<commit_message>
fix(docs): enforce strict XML schema alignment and Normal style justification across entire DOCX monograph
</commit_message>
<xml_diff>
--- a/docs/laporan/DOKUMENTASI_LENGKAP_SISTEM_AGRINEX.docx
+++ b/docs/laporan/DOKUMENTASI_LENGKAP_SISTEM_AGRINEX.docx
@@ -24170,6 +24170,14 @@
     <w:name w:val="Normal"/>
     <w:qFormat/>
     <w:rsid w:val="00FC693F"/>
+    <w:pPr>
+      <w:jc w:val="both"/>
+    </w:pPr>
+    <w:rPr>
+      <w:rFonts w:ascii="Times New Roman" w:hAnsi="Times New Roman"/>
+      <w:color w:val="000000"/>
+      <w:sz w:val="24"/>
+    </w:rPr>
   </w:style>
   <w:style w:type="paragraph" w:styleId="Header">
     <w:name w:val="header"/>

</xml_diff>

<commit_message>
fix: standardize location to Kelurahan Purwawinangun, capture accurate onboarding wizard screenshot, and recompile word report
</commit_message>
<xml_diff>
--- a/docs/laporan/DOKUMENTASI_LENGKAP_SISTEM_AGRINEX.docx
+++ b/docs/laporan/DOKUMENTASI_LENGKAP_SISTEM_AGRINEX.docx
@@ -1944,7 +1944,7 @@
           <w:color w:val="000000"/>
           <w:sz w:val="24"/>
         </w:rPr>
-        <w:t>Pengujian komparasi lapangan dilakukan di Kecamatan Cilimus, Kabupaten Kuningan pada elevasi 560 mdpl selama siklus pengamatan intensif 24 jam terhadap data model BMKG Pos Pengamatan Agroklimat Kuningan / Stasiun Kertajati.</w:t>
+        <w:t>Pengujian komparasi lapangan dilakukan di Kelurahan Purwawinangun, Kecamatan Kuningan, Kabupaten Kuningan pada elevasi 555 mdpl selama siklus pengamatan intensif 24 jam terhadap data model BMKG Pos Pengamatan Agroklimat Kuningan / Stasiun Kertajati.</w:t>
       </w:r>
     </w:p>
     <w:p>
@@ -1984,7 +1984,7 @@
           <w:color w:val="000000"/>
           <w:sz w:val="24"/>
         </w:rPr>
-        <w:t xml:space="preserve"> dengan penyesuaian tekanan barometrik spesifik elevasi 560 mdpl.</w:t>
+        <w:t xml:space="preserve"> dengan penyesuaian tekanan barometrik spesifik elevasi 555 mdpl.</w:t>
       </w:r>
     </w:p>
     <w:p>
@@ -10052,7 +10052,7 @@
           <w:color w:val="000000"/>
           <w:sz w:val="24"/>
         </w:rPr>
-        <w:t xml:space="preserve"> Menyajikan identitas administratif stasiun cuaca ("Kelurahan Kuningan, Kecamatan Kuningan"), koordinat lintang dan bujur, elevasi rujukan topografis (560 mdpl), serta penunjuk waktu nyata (</w:t>
+        <w:t xml:space="preserve"> Menyajikan identitas administratif stasiun cuaca ("Kelurahan Purwawinangun, Kecamatan Kuningan"), koordinat lintang dan bujur, elevasi rujukan topografis (555 mdpl), serta penunjuk waktu nyata (</w:t>
       </w:r>
       <w:r>
         <w:rPr>
@@ -16918,7 +16918,7 @@
           <w:color w:val="000000"/>
           <w:sz w:val="24"/>
         </w:rPr>
-        <w:t>Pengujian lapangan dilaksanakan pada koordinat 6°53'42" LS, 108°29'18" BT (Kecamatan Cilimus, Kabupaten Kuningan, elevasi 560 mdpl) selama 24 jam pengamatan cuaca:</w:t>
+        <w:t>Pengujian lapangan dilaksanakan pada koordinat 6°58'20" LS, 108°28'48" BT (Kelurahan Purwawinangun, Kecamatan Kuningan, Kabupaten Kuningan, elevasi 555 mdpl) selama 24 jam pengamatan cuaca:</w:t>
       </w:r>
     </w:p>
     <w:p>

</xml_diff>